<commit_message>
opd report 2 lab
</commit_message>
<xml_diff>
--- a/Основы профессиональной деятельности/ЛБ2.docx
+++ b/Основы профессиональной деятельности/ЛБ2.docx
@@ -1,6 +1,6 @@
 
 <file path=word/document.xml><?xml version="1.0" encoding="utf-8"?>
-<w:document xmlns:wpc="http://schemas.microsoft.com/office/word/2010/wordprocessingCanvas" xmlns:cx="http://schemas.microsoft.com/office/drawing/2014/chartex" xmlns:cx1="http://schemas.microsoft.com/office/drawing/2015/9/8/chartex" xmlns:cx2="http://schemas.microsoft.com/office/drawing/2015/10/21/chartex" xmlns:cx3="http://schemas.microsoft.com/office/drawing/2016/5/9/chartex" xmlns:cx4="http://schemas.microsoft.com/office/drawing/2016/5/10/chartex" xmlns:cx5="http://schemas.microsoft.com/office/drawing/2016/5/11/chartex" xmlns:cx6="http://schemas.microsoft.com/office/drawing/2016/5/12/chartex" xmlns:cx7="http://schemas.microsoft.com/office/drawing/2016/5/13/chartex" xmlns:cx8="http://schemas.microsoft.com/office/drawing/2016/5/14/chartex" xmlns:mc="http://schemas.openxmlformats.org/markup-compatibility/2006" xmlns:aink="http://schemas.microsoft.com/office/drawing/2016/ink" xmlns:am3d="http://schemas.microsoft.com/office/drawing/2017/model3d" xmlns:o="urn:schemas-microsoft-com:office:office" xmlns:oel="http://schemas.microsoft.com/office/2019/extlst" xmlns:r="http://schemas.openxmlformats.org/officeDocument/2006/relationships" xmlns:m="http://schemas.openxmlformats.org/officeDocument/2006/math" xmlns:v="urn:schemas-microsoft-com:vml" xmlns:wp14="http://schemas.microsoft.com/office/word/2010/wordprocessingDrawing" xmlns:wp="http://schemas.openxmlformats.org/drawingml/2006/wordprocessingDrawing" xmlns:w10="urn:schemas-microsoft-com:office:word" xmlns:w="http://schemas.openxmlformats.org/wordprocessingml/2006/main" xmlns:w14="http://schemas.microsoft.com/office/word/2010/wordml" xmlns:w15="http://schemas.microsoft.com/office/word/2012/wordml" xmlns:w16cex="http://schemas.microsoft.com/office/word/2018/wordml/cex" xmlns:w16cid="http://schemas.microsoft.com/office/word/2016/wordml/cid" xmlns:w16="http://schemas.microsoft.com/office/word/2018/wordml" xmlns:w16sdtdh="http://schemas.microsoft.com/office/word/2020/wordml/sdtdatahash" xmlns:w16se="http://schemas.microsoft.com/office/word/2015/wordml/symex" xmlns:wpg="http://schemas.microsoft.com/office/word/2010/wordprocessingGroup" xmlns:wpi="http://schemas.microsoft.com/office/word/2010/wordprocessingInk" xmlns:wne="http://schemas.microsoft.com/office/word/2006/wordml" xmlns:wps="http://schemas.microsoft.com/office/word/2010/wordprocessingShape" mc:Ignorable="w14 w15 w16se w16cid w16 w16cex w16sdtdh wp14">
+<w:document xmlns:wpc="http://schemas.microsoft.com/office/word/2010/wordprocessingCanvas" xmlns:cx="http://schemas.microsoft.com/office/drawing/2014/chartex" xmlns:cx1="http://schemas.microsoft.com/office/drawing/2015/9/8/chartex" xmlns:cx2="http://schemas.microsoft.com/office/drawing/2015/10/21/chartex" xmlns:cx3="http://schemas.microsoft.com/office/drawing/2016/5/9/chartex" xmlns:cx4="http://schemas.microsoft.com/office/drawing/2016/5/10/chartex" xmlns:cx5="http://schemas.microsoft.com/office/drawing/2016/5/11/chartex" xmlns:cx6="http://schemas.microsoft.com/office/drawing/2016/5/12/chartex" xmlns:cx7="http://schemas.microsoft.com/office/drawing/2016/5/13/chartex" xmlns:cx8="http://schemas.microsoft.com/office/drawing/2016/5/14/chartex" xmlns:mc="http://schemas.openxmlformats.org/markup-compatibility/2006" xmlns:aink="http://schemas.microsoft.com/office/drawing/2016/ink" xmlns:am3d="http://schemas.microsoft.com/office/drawing/2017/model3d" xmlns:o="urn:schemas-microsoft-com:office:office" xmlns:r="http://schemas.openxmlformats.org/officeDocument/2006/relationships" xmlns:m="http://schemas.openxmlformats.org/officeDocument/2006/math" xmlns:v="urn:schemas-microsoft-com:vml" xmlns:wp14="http://schemas.microsoft.com/office/word/2010/wordprocessingDrawing" xmlns:wp="http://schemas.openxmlformats.org/drawingml/2006/wordprocessingDrawing" xmlns:w10="urn:schemas-microsoft-com:office:word" xmlns:w="http://schemas.openxmlformats.org/wordprocessingml/2006/main" xmlns:w14="http://schemas.microsoft.com/office/word/2010/wordml" xmlns:w15="http://schemas.microsoft.com/office/word/2012/wordml" xmlns:w16cex="http://schemas.microsoft.com/office/word/2018/wordml/cex" xmlns:w16cid="http://schemas.microsoft.com/office/word/2016/wordml/cid" xmlns:w16="http://schemas.microsoft.com/office/word/2018/wordml" xmlns:w16sdtdh="http://schemas.microsoft.com/office/word/2020/wordml/sdtdatahash" xmlns:w16se="http://schemas.microsoft.com/office/word/2015/wordml/symex" xmlns:wpg="http://schemas.microsoft.com/office/word/2010/wordprocessingGroup" xmlns:wpi="http://schemas.microsoft.com/office/word/2010/wordprocessingInk" xmlns:wne="http://schemas.microsoft.com/office/word/2006/wordml" xmlns:wps="http://schemas.microsoft.com/office/word/2010/wordprocessingShape" mc:Ignorable="w14 w15 w16se w16cid w16 w16cex w16sdtdh wp14">
   <w:body>
     <w:p>
       <w:pPr>
@@ -149,7 +149,6 @@
           <w:color w:val="FF0000"/>
           <w:sz w:val="28"/>
           <w:szCs w:val="28"/>
-          <w:lang w:val="en-US"/>
         </w:rPr>
       </w:pPr>
       <w:r>
@@ -177,7 +176,6 @@
           <w:bCs/>
           <w:sz w:val="28"/>
           <w:szCs w:val="28"/>
-          <w:lang w:val="en-US"/>
         </w:rPr>
         <w:t>2</w:t>
       </w:r>
@@ -504,7 +502,7 @@
           <w:sz w:val="28"/>
           <w:szCs w:val="28"/>
         </w:rPr>
-        <w:t>Парсер — это программа для сбора и систематизации информации, размещенной на различных сайтах. Источником данных может служить текстовое наполнение, HTML-код сайта, заголовки, пункты меню, базы данных и другие элементы. Процесс сбора информации называется парсинг (parsing).</w:t>
+        <w:t>Telegram-бот — это автоматизированное программное приложение, разработанное для работы в мессенджере Telegram, которое взаимодействует с пользователями через текстовые команды, сообщения или встроенные интерфейсы (например, кнопки). Бот функционирует на основе API Telegram, позволяющего ему отправлять и получать сообщения, обрабатывать запросы и выполнять заданные действия, такие как предоставление информации, выполнение задач или интеграция с внешними сервисами. Telegram-боты создаются с использованием различных языков программирования (например, Python, JavaScript) и могут быть настроены для индивидуального или группового общения, что делает их универсальным инструментом для автоматизации процессов и взаимодействия с аудиторией.</w:t>
       </w:r>
     </w:p>
     <w:p>
@@ -563,7 +561,7 @@
           <w:sz w:val="28"/>
           <w:szCs w:val="28"/>
         </w:rPr>
-        <w:t>Распарсить сайт Эльдорадо, вкладку с iPhone, получить список цен всех айфонов, вывести из него min, max и среднее</w:t>
+        <w:t>Чат-бот записи в больницу (ФИО пациента, выбор врача, выбор времени и даты)</w:t>
       </w:r>
       <w:r>
         <w:rPr>
@@ -724,15 +722,7 @@
           <w:sz w:val="28"/>
           <w:szCs w:val="28"/>
         </w:rPr>
-        <w:t xml:space="preserve">Находим </w:t>
-      </w:r>
-      <w:r>
-        <w:rPr>
-          <w:rFonts w:ascii="Times New Roman" w:hAnsi="Times New Roman" w:cs="Times New Roman"/>
-          <w:sz w:val="28"/>
-          <w:szCs w:val="28"/>
-        </w:rPr>
-        <w:t xml:space="preserve">в браузере сайт Эльдорадо, открываем вкладку с </w:t>
+        <w:t xml:space="preserve">Получаем токен бота в </w:t>
       </w:r>
       <w:r>
         <w:rPr>
@@ -741,7 +731,7 @@
           <w:szCs w:val="28"/>
           <w:lang w:val="en-US"/>
         </w:rPr>
-        <w:t>iPhone</w:t>
+        <w:t>BotFather</w:t>
       </w:r>
       <w:r>
         <w:rPr>
@@ -757,24 +747,7 @@
           <w:sz w:val="28"/>
           <w:szCs w:val="28"/>
         </w:rPr>
-        <w:t xml:space="preserve">и копируем </w:t>
-      </w:r>
-      <w:r>
-        <w:rPr>
-          <w:rFonts w:ascii="Times New Roman" w:hAnsi="Times New Roman" w:cs="Times New Roman"/>
-          <w:sz w:val="28"/>
-          <w:szCs w:val="28"/>
-          <w:lang w:val="en-US"/>
-        </w:rPr>
-        <w:t>URL</w:t>
-      </w:r>
-      <w:r>
-        <w:rPr>
-          <w:rFonts w:ascii="Times New Roman" w:hAnsi="Times New Roman" w:cs="Times New Roman"/>
-          <w:sz w:val="28"/>
-          <w:szCs w:val="28"/>
-        </w:rPr>
-        <w:t>, который вставляем в наш код.</w:t>
+        <w:t>в телеграм.</w:t>
       </w:r>
     </w:p>
     <w:p>
@@ -797,7 +770,40 @@
           <w:sz w:val="28"/>
           <w:szCs w:val="28"/>
         </w:rPr>
-        <w:t>В браузере открываем средства разработчика для данного сайта и в коде сайта находим элементы, которые отвечают за отображение позиций.</w:t>
+        <w:t xml:space="preserve">Создаём структуру проекта и в файле </w:t>
+      </w:r>
+      <w:r>
+        <w:rPr>
+          <w:rFonts w:ascii="Times New Roman" w:hAnsi="Times New Roman" w:cs="Times New Roman"/>
+          <w:sz w:val="28"/>
+          <w:szCs w:val="28"/>
+        </w:rPr>
+        <w:t>.</w:t>
+      </w:r>
+      <w:r>
+        <w:rPr>
+          <w:rFonts w:ascii="Times New Roman" w:hAnsi="Times New Roman" w:cs="Times New Roman"/>
+          <w:sz w:val="28"/>
+          <w:szCs w:val="28"/>
+          <w:lang w:val="en-US"/>
+        </w:rPr>
+        <w:t>env</w:t>
+      </w:r>
+      <w:r>
+        <w:rPr>
+          <w:rFonts w:ascii="Times New Roman" w:hAnsi="Times New Roman" w:cs="Times New Roman"/>
+          <w:sz w:val="28"/>
+          <w:szCs w:val="28"/>
+        </w:rPr>
+        <w:t xml:space="preserve"> </w:t>
+      </w:r>
+      <w:r>
+        <w:rPr>
+          <w:rFonts w:ascii="Times New Roman" w:hAnsi="Times New Roman" w:cs="Times New Roman"/>
+          <w:sz w:val="28"/>
+          <w:szCs w:val="28"/>
+        </w:rPr>
+        <w:t>указываем наш токен.</w:t>
       </w:r>
     </w:p>
     <w:p>
@@ -820,32 +826,7 @@
           <w:sz w:val="28"/>
           <w:szCs w:val="28"/>
         </w:rPr>
-        <w:t xml:space="preserve">В данных элементах находим </w:t>
-      </w:r>
-      <w:r>
-        <w:rPr>
-          <w:rFonts w:ascii="Times New Roman" w:hAnsi="Times New Roman" w:cs="Times New Roman"/>
-          <w:sz w:val="28"/>
-          <w:szCs w:val="28"/>
-          <w:lang w:val="en-US"/>
-        </w:rPr>
-        <w:t>HTML</w:t>
-      </w:r>
-      <w:r>
-        <w:rPr>
-          <w:rFonts w:ascii="Times New Roman" w:hAnsi="Times New Roman" w:cs="Times New Roman"/>
-          <w:sz w:val="28"/>
-          <w:szCs w:val="28"/>
-        </w:rPr>
-        <w:t>-</w:t>
-      </w:r>
-      <w:r>
-        <w:rPr>
-          <w:rFonts w:ascii="Times New Roman" w:hAnsi="Times New Roman" w:cs="Times New Roman"/>
-          <w:sz w:val="28"/>
-          <w:szCs w:val="28"/>
-        </w:rPr>
-        <w:t>тег, отвечающий за цену, переносим его и его класс в код.</w:t>
+        <w:t>Пишем функционал базы данных и логгера.</w:t>
       </w:r>
     </w:p>
     <w:p>
@@ -868,7 +849,7 @@
           <w:sz w:val="28"/>
           <w:szCs w:val="28"/>
         </w:rPr>
-        <w:t>Проверяем наш код обычным выводом всех цен в консоль и понимаем, что ничего не выводится. Это происходит из-за того, что все позиции подгружаются динамически при загрузке сайта, а не сразу формируются в коде страницы.</w:t>
+        <w:t>Прописываем нужные нам хендлеры.</w:t>
       </w:r>
     </w:p>
     <w:p>
@@ -891,40 +872,7 @@
           <w:sz w:val="28"/>
           <w:szCs w:val="28"/>
         </w:rPr>
-        <w:t>Чтобы не усложнять парсер, меняем сайт Эльдорадо на Мегафон, на котором все позиции сразу формируются в</w:t>
-      </w:r>
-      <w:r>
-        <w:rPr>
-          <w:rFonts w:ascii="Times New Roman" w:hAnsi="Times New Roman" w:cs="Times New Roman"/>
-          <w:sz w:val="28"/>
-          <w:szCs w:val="28"/>
-        </w:rPr>
-        <w:t xml:space="preserve"> </w:t>
-      </w:r>
-      <w:r>
-        <w:rPr>
-          <w:rFonts w:ascii="Times New Roman" w:hAnsi="Times New Roman" w:cs="Times New Roman"/>
-          <w:sz w:val="28"/>
-          <w:szCs w:val="28"/>
-          <w:lang w:val="en-US"/>
-        </w:rPr>
-        <w:t>HTML</w:t>
-      </w:r>
-      <w:r>
-        <w:rPr>
-          <w:rFonts w:ascii="Times New Roman" w:hAnsi="Times New Roman" w:cs="Times New Roman"/>
-          <w:sz w:val="28"/>
-          <w:szCs w:val="28"/>
-        </w:rPr>
-        <w:t>-</w:t>
-      </w:r>
-      <w:r>
-        <w:rPr>
-          <w:rFonts w:ascii="Times New Roman" w:hAnsi="Times New Roman" w:cs="Times New Roman"/>
-          <w:sz w:val="28"/>
-          <w:szCs w:val="28"/>
-        </w:rPr>
-        <w:t>коде.</w:t>
+        <w:t>Проверяем бота в телеграм.</w:t>
       </w:r>
     </w:p>
     <w:p>
@@ -947,115 +895,7 @@
           <w:sz w:val="28"/>
           <w:szCs w:val="28"/>
         </w:rPr>
-        <w:t>Повторяем шаги 2-4, а при выполнении 5 шага видим, что в консоли появился список цен.</w:t>
-      </w:r>
-    </w:p>
-    <w:p>
-      <w:pPr>
-        <w:pStyle w:val="a7"/>
-        <w:numPr>
-          <w:ilvl w:val="0"/>
-          <w:numId w:val="2"/>
-        </w:numPr>
-        <w:jc w:val="both"/>
-        <w:rPr>
-          <w:rFonts w:ascii="Times New Roman" w:hAnsi="Times New Roman" w:cs="Times New Roman"/>
-          <w:sz w:val="28"/>
-          <w:szCs w:val="28"/>
-        </w:rPr>
-      </w:pPr>
-      <w:r>
-        <w:rPr>
-          <w:rFonts w:ascii="Times New Roman" w:hAnsi="Times New Roman" w:cs="Times New Roman"/>
-          <w:sz w:val="28"/>
-          <w:szCs w:val="28"/>
-        </w:rPr>
-        <w:t>Убираем вывод в консоль и делаем добавление каждой цены в массив.</w:t>
-      </w:r>
-    </w:p>
-    <w:p>
-      <w:pPr>
-        <w:pStyle w:val="a7"/>
-        <w:numPr>
-          <w:ilvl w:val="0"/>
-          <w:numId w:val="2"/>
-        </w:numPr>
-        <w:jc w:val="both"/>
-        <w:rPr>
-          <w:rFonts w:ascii="Times New Roman" w:hAnsi="Times New Roman" w:cs="Times New Roman"/>
-          <w:sz w:val="28"/>
-          <w:szCs w:val="28"/>
-        </w:rPr>
-      </w:pPr>
-      <w:r>
-        <w:rPr>
-          <w:rFonts w:ascii="Times New Roman" w:hAnsi="Times New Roman" w:cs="Times New Roman"/>
-          <w:sz w:val="28"/>
-          <w:szCs w:val="28"/>
-        </w:rPr>
-        <w:t>Добавляем функции для подсчёта минимального, максимального и среднего значения в массиве и выводим данные значения.</w:t>
-      </w:r>
-    </w:p>
-    <w:p>
-      <w:pPr>
-        <w:pStyle w:val="a7"/>
-        <w:numPr>
-          <w:ilvl w:val="0"/>
-          <w:numId w:val="2"/>
-        </w:numPr>
-        <w:jc w:val="both"/>
-        <w:rPr>
-          <w:rFonts w:ascii="Times New Roman" w:hAnsi="Times New Roman" w:cs="Times New Roman"/>
-          <w:sz w:val="28"/>
-          <w:szCs w:val="28"/>
-        </w:rPr>
-      </w:pPr>
-      <w:r>
-        <w:rPr>
-          <w:rFonts w:ascii="Times New Roman" w:hAnsi="Times New Roman" w:cs="Times New Roman"/>
-          <w:sz w:val="28"/>
-          <w:szCs w:val="28"/>
-        </w:rPr>
-        <w:t xml:space="preserve">Сравниваем с значениями на сайте и видим, что </w:t>
-      </w:r>
-      <w:r>
-        <w:rPr>
-          <w:rFonts w:ascii="Times New Roman" w:hAnsi="Times New Roman" w:cs="Times New Roman"/>
-          <w:sz w:val="28"/>
-          <w:szCs w:val="28"/>
-        </w:rPr>
-        <w:t>цифры не совпадают</w:t>
-      </w:r>
-      <w:r>
-        <w:rPr>
-          <w:rFonts w:ascii="Times New Roman" w:hAnsi="Times New Roman" w:cs="Times New Roman"/>
-          <w:sz w:val="28"/>
-          <w:szCs w:val="28"/>
-        </w:rPr>
-        <w:t>, т.к. мы парсили только первую страницу, а их на сайте больше.</w:t>
-      </w:r>
-    </w:p>
-    <w:p>
-      <w:pPr>
-        <w:pStyle w:val="a7"/>
-        <w:numPr>
-          <w:ilvl w:val="0"/>
-          <w:numId w:val="2"/>
-        </w:numPr>
-        <w:jc w:val="both"/>
-        <w:rPr>
-          <w:rFonts w:ascii="Times New Roman" w:hAnsi="Times New Roman" w:cs="Times New Roman"/>
-          <w:sz w:val="28"/>
-          <w:szCs w:val="28"/>
-        </w:rPr>
-      </w:pPr>
-      <w:r>
-        <w:rPr>
-          <w:rFonts w:ascii="Times New Roman" w:hAnsi="Times New Roman" w:cs="Times New Roman"/>
-          <w:sz w:val="28"/>
-          <w:szCs w:val="28"/>
-        </w:rPr>
-        <w:t xml:space="preserve">Меняем код парсера и делаем парсер в цикле с подстановкой в </w:t>
+        <w:t xml:space="preserve">Загружаем проект на </w:t>
       </w:r>
       <w:r>
         <w:rPr>
@@ -1064,86 +904,7 @@
           <w:szCs w:val="28"/>
           <w:lang w:val="en-US"/>
         </w:rPr>
-        <w:t>URL</w:t>
-      </w:r>
-      <w:r>
-        <w:rPr>
-          <w:rFonts w:ascii="Times New Roman" w:hAnsi="Times New Roman" w:cs="Times New Roman"/>
-          <w:sz w:val="28"/>
-          <w:szCs w:val="28"/>
-        </w:rPr>
-        <w:t xml:space="preserve"> </w:t>
-      </w:r>
-      <w:r>
-        <w:rPr>
-          <w:rFonts w:ascii="Times New Roman" w:hAnsi="Times New Roman" w:cs="Times New Roman"/>
-          <w:sz w:val="28"/>
-          <w:szCs w:val="28"/>
-        </w:rPr>
-        <w:t>номера страницы.</w:t>
-      </w:r>
-    </w:p>
-    <w:p>
-      <w:pPr>
-        <w:pStyle w:val="a7"/>
-        <w:numPr>
-          <w:ilvl w:val="0"/>
-          <w:numId w:val="2"/>
-        </w:numPr>
-        <w:jc w:val="both"/>
-        <w:rPr>
-          <w:rFonts w:ascii="Times New Roman" w:hAnsi="Times New Roman" w:cs="Times New Roman"/>
-          <w:sz w:val="28"/>
-          <w:szCs w:val="28"/>
-        </w:rPr>
-      </w:pPr>
-      <w:r>
-        <w:rPr>
-          <w:rFonts w:ascii="Times New Roman" w:hAnsi="Times New Roman" w:cs="Times New Roman"/>
-          <w:sz w:val="28"/>
-          <w:szCs w:val="28"/>
-        </w:rPr>
-        <w:t>Проверяем снова и видим, что результаты совпадают.</w:t>
-      </w:r>
-    </w:p>
-    <w:p>
-      <w:pPr>
-        <w:pStyle w:val="a7"/>
-        <w:numPr>
-          <w:ilvl w:val="0"/>
-          <w:numId w:val="2"/>
-        </w:numPr>
-        <w:jc w:val="both"/>
-        <w:rPr>
-          <w:rFonts w:ascii="Times New Roman" w:hAnsi="Times New Roman" w:cs="Times New Roman"/>
-          <w:sz w:val="28"/>
-          <w:szCs w:val="28"/>
-        </w:rPr>
-      </w:pPr>
-      <w:r>
-        <w:rPr>
-          <w:rFonts w:ascii="Times New Roman" w:hAnsi="Times New Roman" w:cs="Times New Roman"/>
-          <w:sz w:val="28"/>
-          <w:szCs w:val="28"/>
-        </w:rPr>
-        <w:t xml:space="preserve">Загружаем проект на </w:t>
-      </w:r>
-      <w:r>
-        <w:rPr>
-          <w:rFonts w:ascii="Times New Roman" w:hAnsi="Times New Roman" w:cs="Times New Roman"/>
-          <w:sz w:val="28"/>
-          <w:szCs w:val="28"/>
-          <w:lang w:val="en-US"/>
-        </w:rPr>
-        <w:t>GitHub</w:t>
-      </w:r>
-      <w:r>
-        <w:rPr>
-          <w:rFonts w:ascii="Times New Roman" w:hAnsi="Times New Roman" w:cs="Times New Roman"/>
-          <w:sz w:val="28"/>
-          <w:szCs w:val="28"/>
-        </w:rPr>
-        <w:t>.</w:t>
+        <w:t>GitHub.</w:t>
       </w:r>
     </w:p>
     <w:p>
@@ -1936,7 +1697,7 @@
 </file>
 
 <file path=word/numbering.xml><?xml version="1.0" encoding="utf-8"?>
-<w:numbering xmlns:wpc="http://schemas.microsoft.com/office/word/2010/wordprocessingCanvas" xmlns:cx="http://schemas.microsoft.com/office/drawing/2014/chartex" xmlns:cx1="http://schemas.microsoft.com/office/drawing/2015/9/8/chartex" xmlns:cx2="http://schemas.microsoft.com/office/drawing/2015/10/21/chartex" xmlns:cx3="http://schemas.microsoft.com/office/drawing/2016/5/9/chartex" xmlns:cx4="http://schemas.microsoft.com/office/drawing/2016/5/10/chartex" xmlns:cx5="http://schemas.microsoft.com/office/drawing/2016/5/11/chartex" xmlns:cx6="http://schemas.microsoft.com/office/drawing/2016/5/12/chartex" xmlns:cx7="http://schemas.microsoft.com/office/drawing/2016/5/13/chartex" xmlns:cx8="http://schemas.microsoft.com/office/drawing/2016/5/14/chartex" xmlns:mc="http://schemas.openxmlformats.org/markup-compatibility/2006" xmlns:aink="http://schemas.microsoft.com/office/drawing/2016/ink" xmlns:am3d="http://schemas.microsoft.com/office/drawing/2017/model3d" xmlns:o="urn:schemas-microsoft-com:office:office" xmlns:oel="http://schemas.microsoft.com/office/2019/extlst" xmlns:r="http://schemas.openxmlformats.org/officeDocument/2006/relationships" xmlns:m="http://schemas.openxmlformats.org/officeDocument/2006/math" xmlns:v="urn:schemas-microsoft-com:vml" xmlns:wp14="http://schemas.microsoft.com/office/word/2010/wordprocessingDrawing" xmlns:wp="http://schemas.openxmlformats.org/drawingml/2006/wordprocessingDrawing" xmlns:w10="urn:schemas-microsoft-com:office:word" xmlns:w="http://schemas.openxmlformats.org/wordprocessingml/2006/main" xmlns:w14="http://schemas.microsoft.com/office/word/2010/wordml" xmlns:w15="http://schemas.microsoft.com/office/word/2012/wordml" xmlns:w16cex="http://schemas.microsoft.com/office/word/2018/wordml/cex" xmlns:w16cid="http://schemas.microsoft.com/office/word/2016/wordml/cid" xmlns:w16="http://schemas.microsoft.com/office/word/2018/wordml" xmlns:w16sdtdh="http://schemas.microsoft.com/office/word/2020/wordml/sdtdatahash" xmlns:w16se="http://schemas.microsoft.com/office/word/2015/wordml/symex" xmlns:wpg="http://schemas.microsoft.com/office/word/2010/wordprocessingGroup" xmlns:wpi="http://schemas.microsoft.com/office/word/2010/wordprocessingInk" xmlns:wne="http://schemas.microsoft.com/office/word/2006/wordml" xmlns:wps="http://schemas.microsoft.com/office/word/2010/wordprocessingShape" mc:Ignorable="w14 w15 w16se w16cid w16 w16cex w16sdtdh wp14">
+<w:numbering xmlns:wpc="http://schemas.microsoft.com/office/word/2010/wordprocessingCanvas" xmlns:cx="http://schemas.microsoft.com/office/drawing/2014/chartex" xmlns:cx1="http://schemas.microsoft.com/office/drawing/2015/9/8/chartex" xmlns:cx2="http://schemas.microsoft.com/office/drawing/2015/10/21/chartex" xmlns:cx3="http://schemas.microsoft.com/office/drawing/2016/5/9/chartex" xmlns:cx4="http://schemas.microsoft.com/office/drawing/2016/5/10/chartex" xmlns:cx5="http://schemas.microsoft.com/office/drawing/2016/5/11/chartex" xmlns:cx6="http://schemas.microsoft.com/office/drawing/2016/5/12/chartex" xmlns:cx7="http://schemas.microsoft.com/office/drawing/2016/5/13/chartex" xmlns:cx8="http://schemas.microsoft.com/office/drawing/2016/5/14/chartex" xmlns:mc="http://schemas.openxmlformats.org/markup-compatibility/2006" xmlns:aink="http://schemas.microsoft.com/office/drawing/2016/ink" xmlns:am3d="http://schemas.microsoft.com/office/drawing/2017/model3d" xmlns:o="urn:schemas-microsoft-com:office:office" xmlns:r="http://schemas.openxmlformats.org/officeDocument/2006/relationships" xmlns:m="http://schemas.openxmlformats.org/officeDocument/2006/math" xmlns:v="urn:schemas-microsoft-com:vml" xmlns:wp14="http://schemas.microsoft.com/office/word/2010/wordprocessingDrawing" xmlns:wp="http://schemas.openxmlformats.org/drawingml/2006/wordprocessingDrawing" xmlns:w10="urn:schemas-microsoft-com:office:word" xmlns:w="http://schemas.openxmlformats.org/wordprocessingml/2006/main" xmlns:w14="http://schemas.microsoft.com/office/word/2010/wordml" xmlns:w15="http://schemas.microsoft.com/office/word/2012/wordml" xmlns:w16cex="http://schemas.microsoft.com/office/word/2018/wordml/cex" xmlns:w16cid="http://schemas.microsoft.com/office/word/2016/wordml/cid" xmlns:w16="http://schemas.microsoft.com/office/word/2018/wordml" xmlns:w16sdtdh="http://schemas.microsoft.com/office/word/2020/wordml/sdtdatahash" xmlns:w16se="http://schemas.microsoft.com/office/word/2015/wordml/symex" xmlns:wpg="http://schemas.microsoft.com/office/word/2010/wordprocessingGroup" xmlns:wpi="http://schemas.microsoft.com/office/word/2010/wordprocessingInk" xmlns:wne="http://schemas.microsoft.com/office/word/2006/wordml" xmlns:wps="http://schemas.microsoft.com/office/word/2010/wordprocessingShape" mc:Ignorable="w14 w15 w16se w16cid w16 w16cex w16sdtdh wp14">
   <w:abstractNum w:abstractNumId="0" w15:restartNumberingAfterBreak="0">
     <w:nsid w:val="29A02481"/>
     <w:multiLevelType w:val="hybridMultilevel"/>
@@ -2142,10 +1903,10 @@
       </w:pPr>
     </w:lvl>
   </w:abstractNum>
-  <w:num w:numId="1" w16cid:durableId="1384019484">
+  <w:num w:numId="1">
     <w:abstractNumId w:val="0"/>
   </w:num>
-  <w:num w:numId="2" w16cid:durableId="247541468">
+  <w:num w:numId="2">
     <w:abstractNumId w:val="1"/>
   </w:num>
 </w:numbering>

</xml_diff>